<commit_message>
Se agregaron nuevos archivos
</commit_message>
<xml_diff>
--- a/docs/report/process_report.docx
+++ b/docs/report/process_report.docx
@@ -24,45 +24,71 @@
       <w:pPr>
         <w:ind w:left="708"/>
         <w:jc w:val="both"/>
-      </w:pPr>
-      <w:r>
-        <w:t xml:space="preserve">Explicar en resumen todo lo que se hizo, </w:t>
-      </w:r>
-      <w:r>
-        <w:t>todo lo que se va a ver</w:t>
-      </w:r>
-      <w:r>
-        <w:t xml:space="preserve"> más adelante en </w:t>
-      </w:r>
-      <w:r>
-        <w:t>este</w:t>
-      </w:r>
-      <w:r>
-        <w:t xml:space="preserve"> documento, y los resultados esperados</w:t>
-      </w:r>
-      <w:r>
-        <w:t>/obtenidos</w:t>
-      </w:r>
-      <w:r>
-        <w:t>.</w:t>
+        <w:rPr>
+          <w:lang w:val="es-419"/>
+        </w:rPr>
+      </w:pPr>
+      <w:r>
+        <w:rPr>
+          <w:lang w:val="es-419"/>
+        </w:rPr>
+        <w:t xml:space="preserve">Este trabajo consiste en el diseño e implementación de un sistema de adquisición y visualización de datos provenientes de sensores de lluvia instalados en estaciones meteorológicas distribuidas a lo largo del arroyo </w:t>
+      </w:r>
+      <w:proofErr w:type="spellStart"/>
+      <w:r>
+        <w:rPr>
+          <w:lang w:val="es-419"/>
+        </w:rPr>
+        <w:t>Mburicao</w:t>
+      </w:r>
+      <w:proofErr w:type="spellEnd"/>
+      <w:r>
+        <w:rPr>
+          <w:lang w:val="es-419"/>
+        </w:rPr>
+        <w:t>. La propuesta surge ante la necesidad de contar con información local y distribuida sobre precipitaciones, que permita un mejor monitoreo del comportamiento pluviométrico en la zona.</w:t>
       </w:r>
     </w:p>
     <w:p>
       <w:pPr>
         <w:ind w:left="708"/>
         <w:jc w:val="both"/>
-      </w:pPr>
-      <w:r>
-        <w:t>Esta</w:t>
-      </w:r>
-      <w:r>
-        <w:t xml:space="preserve"> sección debe tener un máximo de </w:t>
-      </w:r>
-      <w:r>
-        <w:t>300</w:t>
-      </w:r>
-      <w:r>
-        <w:t xml:space="preserve"> palabras.</w:t>
+        <w:rPr>
+          <w:lang w:val="es-419"/>
+        </w:rPr>
+      </w:pPr>
+      <w:r>
+        <w:rPr>
+          <w:lang w:val="es-419"/>
+        </w:rPr>
+        <w:t>El sistema desarrollado se basa en un sensor óptico de lluvia con comunicación RS485, el cual es integrado a una placa de circuito impreso con componentes de montaje superficial, incluyendo un microcontrolador ESP32. La placa incorpora la etapa de alimentación para reducir el voltaje a 3,3V, el circuito de interfaz RS485 y los elementos necesarios para la transmisión de datos mediante conexión inalámbrica (Wifi y GSM) y almacenamiento local</w:t>
+      </w:r>
+      <w:r>
+        <w:rPr>
+          <w:lang w:val="es-419"/>
+        </w:rPr>
+        <w:t xml:space="preserve"> </w:t>
+      </w:r>
+      <w:r>
+        <w:rPr>
+          <w:lang w:val="es-419"/>
+        </w:rPr>
+        <w:t>(MicroSD).</w:t>
+      </w:r>
+    </w:p>
+    <w:p>
+      <w:pPr>
+        <w:ind w:left="708"/>
+        <w:jc w:val="both"/>
+        <w:rPr>
+          <w:lang w:val="es-419"/>
+        </w:rPr>
+      </w:pPr>
+      <w:r>
+        <w:rPr>
+          <w:lang w:val="es-419"/>
+        </w:rPr>
+        <w:t>Además del diseño electrónico, el proyecto contempla el desarrollo de una interfaz gráfica que permite visualizar en línea los datos adquiridos. Se incluye también el diseño de una estructura mecánica de soporte para el sensor, así como la selección de una caja adecuada para intemperie que garantice la protección del sistema electrónico.</w:t>
       </w:r>
     </w:p>
     <w:p>
@@ -97,14 +123,75 @@
         <w:rPr>
           <w:lang w:val="en-US"/>
         </w:rPr>
-        <w:t>Same as above but in English</w:t>
-      </w:r>
+        <w:t xml:space="preserve">This work consists of the design and implementation of a data acquisition and visualization system for rainfall sensors installed at meteorological stations distributed along the </w:t>
+      </w:r>
+      <w:proofErr w:type="spellStart"/>
       <w:r>
         <w:rPr>
           <w:lang w:val="en-US"/>
         </w:rPr>
-        <w:t>.</w:t>
-      </w:r>
+        <w:t>Mburicao</w:t>
+      </w:r>
+      <w:proofErr w:type="spellEnd"/>
+      <w:r>
+        <w:rPr>
+          <w:lang w:val="en-US"/>
+        </w:rPr>
+        <w:t xml:space="preserve"> stream. The proposal arises from the need for local and distributed rainfall information to allow for better monitoring of </w:t>
+      </w:r>
+      <w:proofErr w:type="spellStart"/>
+      <w:r>
+        <w:rPr>
+          <w:lang w:val="en-US"/>
+        </w:rPr>
+        <w:t>pluviometric</w:t>
+      </w:r>
+      <w:proofErr w:type="spellEnd"/>
+      <w:r>
+        <w:rPr>
+          <w:lang w:val="en-US"/>
+        </w:rPr>
+        <w:t xml:space="preserve"> behavior in the area.</w:t>
+      </w:r>
+    </w:p>
+    <w:p>
+      <w:pPr>
+        <w:ind w:left="708"/>
+        <w:jc w:val="both"/>
+        <w:rPr>
+          <w:lang w:val="en-US"/>
+        </w:rPr>
+      </w:pPr>
+      <w:r>
+        <w:rPr>
+          <w:lang w:val="en-US"/>
+        </w:rPr>
+        <w:t>The developed system is based on an optical rain sensor with RS485 communication, which is integrated into a printed circuit board (PCB) with surface-mount components, including an ESP32 microcontroller. The board incorporates a power stage to reduce the voltage to 3.3V, an RS485 interface circuit, and the necessary elements for data transmission via wireless connection (Wi-Fi and GSM) and local storage (MicroSD).</w:t>
+      </w:r>
+    </w:p>
+    <w:p>
+      <w:pPr>
+        <w:ind w:left="708"/>
+        <w:jc w:val="both"/>
+        <w:rPr>
+          <w:lang w:val="en-US"/>
+        </w:rPr>
+      </w:pPr>
+      <w:r>
+        <w:rPr>
+          <w:lang w:val="en-US"/>
+        </w:rPr>
+        <w:t>In addition to the electronic design, the project covers the development of a graphical interface that allows for the online visualization of the acquired data. It also includes the design of a mechanical support structure for the sensor, as well as the selection of a suitable weatherproof enclosure to ensure the protection of the electronic system.</w:t>
+      </w:r>
+    </w:p>
+    <w:p>
+      <w:pPr>
+        <w:ind w:left="708"/>
+        <w:jc w:val="both"/>
+        <w:rPr>
+          <w:lang w:val="en-US"/>
+        </w:rPr>
+      </w:pPr>
     </w:p>
     <w:p>
       <w:pPr>
@@ -176,6 +263,12 @@
       <w:r>
         <w:t>Las referencias pueden ser sobre una parte del proyecto o de su totalidad.</w:t>
       </w:r>
+    </w:p>
+    <w:p>
+      <w:pPr>
+        <w:ind w:left="708"/>
+        <w:jc w:val="both"/>
+      </w:pPr>
     </w:p>
     <w:p>
       <w:pPr>
@@ -314,18 +407,23 @@
         <w:ind w:left="1416"/>
       </w:pPr>
       <w:r>
-        <w:t>Similar al título del proyecto, pero en infinitivo</w:t>
-      </w:r>
-      <w:r>
-        <w:t>.</w:t>
-      </w:r>
-      <w:r>
-        <w:t xml:space="preserve"> </w:t>
-      </w:r>
-      <w:r>
-        <w:t>Debe contener las palabras claves que identifiquen al proyecto</w:t>
-      </w:r>
-      <w:r>
+        <w:rPr>
+          <w:lang w:val="es-419"/>
+        </w:rPr>
+        <w:t xml:space="preserve">Obtener datos de sensores de lluvia de estaciones meteorológicas distribuidas a lo largo del arroyo </w:t>
+      </w:r>
+      <w:proofErr w:type="spellStart"/>
+      <w:r>
+        <w:rPr>
+          <w:lang w:val="es-419"/>
+        </w:rPr>
+        <w:t>Mburicao</w:t>
+      </w:r>
+      <w:proofErr w:type="spellEnd"/>
+      <w:r>
+        <w:rPr>
+          <w:lang w:val="es-419"/>
+        </w:rPr>
         <w:t>.</w:t>
       </w:r>
     </w:p>
@@ -344,7 +442,6 @@
         <w:rPr>
           <w:b/>
         </w:rPr>
-        <w:lastRenderedPageBreak/>
         <w:t>Específicos</w:t>
       </w:r>
     </w:p>
@@ -352,25 +449,82 @@
       <w:pPr>
         <w:ind w:left="1416"/>
         <w:jc w:val="both"/>
-      </w:pPr>
-      <w:r>
-        <w:t xml:space="preserve">Al menos </w:t>
-      </w:r>
-      <w:r>
-        <w:t>3</w:t>
-      </w:r>
-      <w:r>
-        <w:t>, y en orden en el que se realizaría la investigación y desarrollo, pasando por sus fases de pruebas aisladas</w:t>
-      </w:r>
-      <w:r>
-        <w:t xml:space="preserve"> y</w:t>
-      </w:r>
-      <w:r>
-        <w:t xml:space="preserve"> pruebas integradas</w:t>
-      </w:r>
-      <w:r>
-        <w:t xml:space="preserve"> finales.</w:t>
-      </w:r>
+        <w:rPr>
+          <w:lang w:val="es-419"/>
+        </w:rPr>
+      </w:pPr>
+      <w:r>
+        <w:rPr>
+          <w:lang w:val="es-419"/>
+        </w:rPr>
+        <w:t>Desarrollar una PCB propia para almacenamiento de datos e interfaz entre el sensor de lluvia y una base de datos en línea</w:t>
+      </w:r>
+    </w:p>
+    <w:p>
+      <w:pPr>
+        <w:ind w:left="1416"/>
+        <w:jc w:val="both"/>
+      </w:pPr>
+      <w:r>
+        <w:rPr>
+          <w:lang w:val="es-419"/>
+        </w:rPr>
+        <w:lastRenderedPageBreak/>
+        <w:t>Utilizar una caja apropiada para intemperie como medio de protección para la PCB compatible con la estructura de la estación meteorológica</w:t>
+      </w:r>
+    </w:p>
+    <w:p>
+      <w:pPr>
+        <w:ind w:left="1416"/>
+        <w:jc w:val="both"/>
+      </w:pPr>
+      <w:r>
+        <w:rPr>
+          <w:lang w:val="es-419"/>
+        </w:rPr>
+        <w:t>Desarrollar una interfaz gráfica que permita visualizar</w:t>
+      </w:r>
+      <w:r>
+        <w:rPr>
+          <w:lang w:val="es-419"/>
+        </w:rPr>
+        <w:t xml:space="preserve"> en </w:t>
+      </w:r>
+      <w:proofErr w:type="spellStart"/>
+      <w:r>
+        <w:rPr>
+          <w:lang w:val="es-419"/>
+        </w:rPr>
+        <w:t>linea</w:t>
+      </w:r>
+      <w:proofErr w:type="spellEnd"/>
+      <w:r>
+        <w:rPr>
+          <w:lang w:val="es-419"/>
+        </w:rPr>
+        <w:t xml:space="preserve"> los datos adquiridos</w:t>
+      </w:r>
+    </w:p>
+    <w:p>
+      <w:pPr>
+        <w:ind w:left="1416"/>
+        <w:jc w:val="both"/>
+      </w:pPr>
+      <w:r>
+        <w:rPr>
+          <w:lang w:val="es-419"/>
+        </w:rPr>
+        <w:t>Construir la estructura soporte para el sensor de lluvia compatible con la estación meteorológica</w:t>
+      </w:r>
+    </w:p>
+    <w:p>
+      <w:pPr>
+        <w:ind w:left="1416"/>
+        <w:jc w:val="both"/>
+        <w:rPr>
+          <w:lang w:val="es-419"/>
+        </w:rPr>
+      </w:pPr>
     </w:p>
     <w:p>
       <w:pPr>
@@ -693,6 +847,7 @@
         <w:ind w:left="1416"/>
       </w:pPr>
       <w:r>
+        <w:lastRenderedPageBreak/>
         <w:t>Captura de pantalla de la interfaz de usuario.</w:t>
       </w:r>
     </w:p>
@@ -735,7 +890,6 @@
         <w:rPr>
           <w:b/>
         </w:rPr>
-        <w:lastRenderedPageBreak/>
         <w:t>Costos</w:t>
       </w:r>
     </w:p>
@@ -1200,7 +1354,13 @@
       <w:rPr>
         <w:b/>
       </w:rPr>
-      <w:t>24</w:t>
+      <w:t>2</w:t>
+    </w:r>
+    <w:r>
+      <w:rPr>
+        <w:b/>
+      </w:rPr>
+      <w:t>6</w:t>
     </w:r>
   </w:p>
   <w:p>
@@ -1212,24 +1372,36 @@
       <w:jc w:val="center"/>
       <w:rPr>
         <w:i/>
+        <w:lang w:val="es-419"/>
       </w:rPr>
     </w:pPr>
     <w:r>
       <w:rPr>
         <w:i/>
-      </w:rPr>
-      <w:t>TÍTULO</w:t>
-    </w:r>
-    <w:r>
-      <w:rPr>
-        <w:i/>
-      </w:rPr>
-      <w:t xml:space="preserve"> DEL PROYECTO</w:t>
+        <w:lang w:val="es-419"/>
+      </w:rPr>
+      <w:t>SISTEMA DE ADQUISICIÓN Y VISUALIZACIÓN DE DATOS DE SENSORES DE LLUVIA PARA ESTACIONES METEOROLÓGICAS DISTRIBUIDAS A LO LARGO DEL ARROYO MBURICAO</w:t>
     </w:r>
   </w:p>
   <w:p>
     <w:pPr>
       <w:pStyle w:val="Header"/>
+      <w:pBdr>
+        <w:bottom w:val="single" w:sz="6" w:space="1" w:color="auto"/>
+      </w:pBdr>
+      <w:jc w:val="center"/>
+      <w:rPr>
+        <w:i/>
+        <w:lang w:val="es-419"/>
+      </w:rPr>
+    </w:pPr>
+  </w:p>
+  <w:p>
+    <w:pPr>
+      <w:pStyle w:val="Header"/>
+      <w:rPr>
+        <w:lang w:val="es-419"/>
+      </w:rPr>
     </w:pPr>
   </w:p>
 </w:hdr>
@@ -1966,7 +2138,6 @@
   <w:style w:type="character" w:default="1" w:styleId="DefaultParagraphFont">
     <w:name w:val="Default Paragraph Font"/>
     <w:uiPriority w:val="1"/>
-    <w:semiHidden/>
     <w:unhideWhenUsed/>
   </w:style>
   <w:style w:type="table" w:default="1" w:styleId="TableNormal">

</xml_diff>